<commit_message>
Update report.docx for lab13 (quarto build)
</commit_message>
<xml_diff>
--- a/labs/lab13/report.docx
+++ b/labs/lab13/report.docx
@@ -18,13 +18,64 @@
         <w:t xml:space="preserve">Программирование в shell: ветвления и циклы</w:t>
       </w:r>
     </w:p>
-    <w:bookmarkStart w:id="9" w:name="цель-работы"/>
+    <w:p>
+      <w:pPr>
+        <w:pStyle w:val="Author"/>
+      </w:pPr>
+      <w:r>
+        <w:t xml:space="preserve">Савкин Дмитрий Вадимович</w:t>
+      </w:r>
+    </w:p>
+    <w:p>
+      <w:pPr>
+        <w:pStyle w:val="Date"/>
+      </w:pPr>
+      <w:r>
+        <w:t xml:space="preserve">2026-10-12</w:t>
+      </w:r>
+    </w:p>
+    <w:sdt>
+      <w:sdtPr>
+        <w:docPartObj>
+          <w:docPartGallery w:val="Table of Contents"/>
+          <w:docPartUnique/>
+        </w:docPartObj>
+      </w:sdtPr>
+      <w:sdtContent>
+        <w:p>
+          <w:pPr>
+            <w:pStyle w:val="TOCHeading"/>
+          </w:pPr>
+          <w:r>
+            <w:t xml:space="preserve">Содержание</w:t>
+          </w:r>
+        </w:p>
+        <w:p>
+          <w:r>
+            <w:fldChar w:fldCharType="begin" w:dirty="true"/>
+            <w:instrText xml:space="preserve">TOC \o "1-2" \h \z \u</w:instrText>
+            <w:fldChar w:fldCharType="separate"/>
+            <w:fldChar w:fldCharType="end"/>
+          </w:r>
+        </w:p>
+      </w:sdtContent>
+    </w:sdt>
+    <w:bookmarkStart w:id="15" w:name="введение"/>
     <w:p>
       <w:pPr>
         <w:pStyle w:val="Heading1"/>
       </w:pPr>
       <w:r>
-        <w:t xml:space="preserve">Цель работы</w:t>
+        <w:t xml:space="preserve">1. Введение</w:t>
+      </w:r>
+    </w:p>
+    <w:bookmarkStart w:id="9" w:name="актуальность"/>
+    <w:p>
+      <w:pPr>
+        <w:pStyle w:val="Heading2"/>
+      </w:pPr>
+      <w:r>
+        <w:t xml:space="preserve">1.1 Актуальность</w:t>
       </w:r>
     </w:p>
     <w:p>
@@ -32,17 +83,35 @@
         <w:pStyle w:val="FirstParagraph"/>
       </w:pPr>
       <w:r>
+        <w:t xml:space="preserve">Ветвления и циклы в shell-скриптах позволяют обрабатывать произвольные входные данные и условия — основа практической автоматизации.</w:t>
+      </w:r>
+    </w:p>
+    <w:bookmarkEnd w:id="9"/>
+    <w:bookmarkStart w:id="10" w:name="цель-работы"/>
+    <w:p>
+      <w:pPr>
+        <w:pStyle w:val="Heading2"/>
+      </w:pPr>
+      <w:r>
+        <w:t xml:space="preserve">1.2 Цель работы</w:t>
+      </w:r>
+    </w:p>
+    <w:p>
+      <w:pPr>
+        <w:pStyle w:val="FirstParagraph"/>
+      </w:pPr>
+      <w:r>
         <w:t xml:space="preserve">Навыки shell-программирования: ветвления и циклы.</w:t>
       </w:r>
     </w:p>
-    <w:bookmarkEnd w:id="9"/>
-    <w:bookmarkStart w:id="10" w:name="задание"/>
-    <w:p>
-      <w:pPr>
-        <w:pStyle w:val="Heading1"/>
-      </w:pPr>
-      <w:r>
-        <w:t xml:space="preserve">Задание</w:t>
+    <w:bookmarkEnd w:id="10"/>
+    <w:bookmarkStart w:id="11" w:name="задачи"/>
+    <w:p>
+      <w:pPr>
+        <w:pStyle w:val="Heading2"/>
+      </w:pPr>
+      <w:r>
+        <w:t xml:space="preserve">1.3 Задачи</w:t>
       </w:r>
     </w:p>
     <w:p>
@@ -141,14 +210,69 @@
         <w:t xml:space="preserve">за неделю.</w:t>
       </w:r>
     </w:p>
-    <w:bookmarkEnd w:id="10"/>
-    <w:bookmarkStart w:id="26" w:name="выполнение-лабораторной-работы"/>
+    <w:bookmarkEnd w:id="11"/>
+    <w:bookmarkStart w:id="12" w:name="объект-и-предмет-исследования"/>
+    <w:p>
+      <w:pPr>
+        <w:pStyle w:val="Heading2"/>
+      </w:pPr>
+      <w:r>
+        <w:t xml:space="preserve">1.4 Объект и предмет исследования</w:t>
+      </w:r>
+    </w:p>
+    <w:p>
+      <w:pPr>
+        <w:pStyle w:val="FirstParagraph"/>
+      </w:pPr>
+      <w:r>
+        <w:t xml:space="preserve">Объект — bash-скрипты; предмет — конструкции ветвления и циклов.</w:t>
+      </w:r>
+    </w:p>
+    <w:bookmarkEnd w:id="12"/>
+    <w:bookmarkStart w:id="13" w:name="методы-исследования"/>
+    <w:p>
+      <w:pPr>
+        <w:pStyle w:val="Heading2"/>
+      </w:pPr>
+      <w:r>
+        <w:t xml:space="preserve">1.5 Методы исследования</w:t>
+      </w:r>
+    </w:p>
+    <w:p>
+      <w:pPr>
+        <w:pStyle w:val="FirstParagraph"/>
+      </w:pPr>
+      <w:r>
+        <w:t xml:space="preserve">Эмпирический метод: практическое выполнение заданий в виртуальной машине Fedora Linux с фиксацией результатов скриншотами и видеозаписью.</w:t>
+      </w:r>
+    </w:p>
+    <w:bookmarkEnd w:id="13"/>
+    <w:bookmarkStart w:id="14" w:name="схема-выполнения-работы"/>
+    <w:p>
+      <w:pPr>
+        <w:pStyle w:val="Heading2"/>
+      </w:pPr>
+      <w:r>
+        <w:t xml:space="preserve">1.6 Схема выполнения работы</w:t>
+      </w:r>
+    </w:p>
+    <w:p>
+      <w:pPr>
+        <w:pStyle w:val="FirstParagraph"/>
+      </w:pPr>
+      <w:r>
+        <w:t xml:space="preserve">Работа выполнялась по стандартной схеме курса: выполнение действия в виртуальной машине, фиксация скриншотом, занесение в отчёт, публикация в git-репозиторий отдельным релизом.</w:t>
+      </w:r>
+    </w:p>
+    <w:bookmarkEnd w:id="14"/>
+    <w:bookmarkEnd w:id="15"/>
+    <w:bookmarkStart w:id="16" w:name="теоретическая-часть"/>
     <w:p>
       <w:pPr>
         <w:pStyle w:val="Heading1"/>
       </w:pPr>
       <w:r>
-        <w:t xml:space="preserve">Выполнение лабораторной работы</w:t>
+        <w:t xml:space="preserve">2. Теоретическая часть</w:t>
       </w:r>
     </w:p>
     <w:p>
@@ -156,6 +280,137 @@
         <w:pStyle w:val="FirstParagraph"/>
       </w:pPr>
       <w:r>
+        <w:t xml:space="preserve">Условные конструкции (</w:t>
+      </w:r>
+      <w:r>
+        <w:rPr>
+          <w:rStyle w:val="VerbatimChar"/>
+        </w:rPr>
+        <w:t xml:space="preserve">if</w:t>
+      </w:r>
+      <w:r>
+        <w:t xml:space="preserve">,</w:t>
+      </w:r>
+      <w:r>
+        <w:t xml:space="preserve"> </w:t>
+      </w:r>
+      <w:r>
+        <w:rPr>
+          <w:rStyle w:val="VerbatimChar"/>
+        </w:rPr>
+        <w:t xml:space="preserve">case</w:t>
+      </w:r>
+      <w:r>
+        <w:t xml:space="preserve">) и циклы (</w:t>
+      </w:r>
+      <w:r>
+        <w:rPr>
+          <w:rStyle w:val="VerbatimChar"/>
+        </w:rPr>
+        <w:t xml:space="preserve">for</w:t>
+      </w:r>
+      <w:r>
+        <w:t xml:space="preserve">,</w:t>
+      </w:r>
+      <w:r>
+        <w:t xml:space="preserve"> </w:t>
+      </w:r>
+      <w:r>
+        <w:rPr>
+          <w:rStyle w:val="VerbatimChar"/>
+        </w:rPr>
+        <w:t xml:space="preserve">while</w:t>
+      </w:r>
+      <w:r>
+        <w:t xml:space="preserve">,</w:t>
+      </w:r>
+      <w:r>
+        <w:t xml:space="preserve"> </w:t>
+      </w:r>
+      <w:r>
+        <w:rPr>
+          <w:rStyle w:val="VerbatimChar"/>
+        </w:rPr>
+        <w:t xml:space="preserve">until</w:t>
+      </w:r>
+      <w:r>
+        <w:t xml:space="preserve">) в сочетании с кодами возврата команд (</w:t>
+      </w:r>
+      <w:r>
+        <w:rPr>
+          <w:rStyle w:val="VerbatimChar"/>
+        </w:rPr>
+        <w:t xml:space="preserve">$?</w:t>
+      </w:r>
+      <w:r>
+        <w:t xml:space="preserve">) образуют основу логики shell-скриптов. Утилита</w:t>
+      </w:r>
+      <w:r>
+        <w:t xml:space="preserve"> </w:t>
+      </w:r>
+      <w:r>
+        <w:rPr>
+          <w:rStyle w:val="VerbatimChar"/>
+        </w:rPr>
+        <w:t xml:space="preserve">getopts</w:t>
+      </w:r>
+      <w:r>
+        <w:t xml:space="preserve"> </w:t>
+      </w:r>
+      <w:r>
+        <w:t xml:space="preserve">реализует стандартный разбор флагов командной строки по соглашению POSIX.</w:t>
+      </w:r>
+    </w:p>
+    <w:p>
+      <w:pPr>
+        <w:pStyle w:val="BodyText"/>
+      </w:pPr>
+      <w:r>
+        <w:t xml:space="preserve">Более подробно см. в</w:t>
+      </w:r>
+      <w:r>
+        <w:t xml:space="preserve"> </w:t>
+      </w:r>
+      <w:r>
+        <w:t xml:space="preserve">[1]</w:t>
+      </w:r>
+      <w:r>
+        <w:t xml:space="preserve">.</w:t>
+      </w:r>
+    </w:p>
+    <w:bookmarkEnd w:id="16"/>
+    <w:bookmarkStart w:id="17" w:name="материалы-и-методы"/>
+    <w:p>
+      <w:pPr>
+        <w:pStyle w:val="Heading1"/>
+      </w:pPr>
+      <w:r>
+        <w:t xml:space="preserve">3. Материалы и методы</w:t>
+      </w:r>
+    </w:p>
+    <w:p>
+      <w:pPr>
+        <w:pStyle w:val="FirstParagraph"/>
+      </w:pPr>
+      <w:r>
+        <w:t xml:space="preserve">Используемое ПО и оборудование: хост-машина под управлением Windows, гипервизор VirtualBox, виртуальная машина с Fedora Linux (Sway), стандартные утилиты дистрибутива.</w:t>
+      </w:r>
+    </w:p>
+    <w:bookmarkEnd w:id="17"/>
+    <w:bookmarkStart w:id="33" w:name="выполнение-лабораторной-работы"/>
+    <w:p>
+      <w:pPr>
+        <w:pStyle w:val="Heading1"/>
+      </w:pPr>
+      <w:r>
+        <w:t xml:space="preserve">4. Выполнение лабораторной работы</w:t>
+      </w:r>
+    </w:p>
+    <w:p>
+      <w:pPr>
+        <w:pStyle w:val="FirstParagraph"/>
+      </w:pPr>
+      <w:r>
         <w:t xml:space="preserve">Создаём рабочий каталог:</w:t>
       </w:r>
       <w:r>
@@ -170,25 +425,25 @@
     </w:p>
     <w:p>
       <w:pPr>
-        <w:pStyle w:val="BodyText"/>
+        <w:pStyle w:val="CaptionedFigure"/>
       </w:pPr>
       <w:r>
         <w:drawing>
           <wp:inline>
             <wp:extent cx="3733800" cy="2100262"/>
             <wp:effectExtent b="0" l="0" r="0" t="0"/>
-            <wp:docPr descr="" title="" id="12" name="Picture"/>
+            <wp:docPr descr="Создаём рабочий каталог: ‘mkdir -p ~/work/os/lab13 &amp;&amp; cd ~/work/os/lab13’" title="" id="19" name="Picture"/>
             <a:graphic>
               <a:graphicData uri="http://schemas.openxmlformats.org/drawingml/2006/picture">
                 <pic:pic>
                   <pic:nvPicPr>
-                    <pic:cNvPr descr="фото/1.png" id="13" name="Picture"/>
+                    <pic:cNvPr descr="image/1.png" id="20" name="Picture"/>
                     <pic:cNvPicPr>
                       <a:picLocks noChangeArrowheads="1" noChangeAspect="1"/>
                     </pic:cNvPicPr>
                   </pic:nvPicPr>
                   <pic:blipFill>
-                    <a:blip r:embed="rId11"/>
+                    <a:blip r:embed="rId18"/>
                     <a:stretch>
                       <a:fillRect/>
                     </a:stretch>
@@ -217,6 +472,20 @@
     </w:p>
     <w:p>
       <w:pPr>
+        <w:pStyle w:val="ImageCaption"/>
+      </w:pPr>
+      <w:r>
+        <w:t xml:space="preserve">Создаём рабочий каталог:</w:t>
+      </w:r>
+      <w:r>
+        <w:t xml:space="preserve"> </w:t>
+      </w:r>
+      <w:r>
+        <w:t xml:space="preserve">‘mkdir -p ~/work/os/lab13 &amp;&amp; cd ~/work/os/lab13’</w:t>
+      </w:r>
+    </w:p>
+    <w:p>
+      <w:pPr>
         <w:pStyle w:val="BodyText"/>
       </w:pPr>
       <w:r>
@@ -234,25 +503,25 @@
     </w:p>
     <w:p>
       <w:pPr>
-        <w:pStyle w:val="BodyText"/>
+        <w:pStyle w:val="CaptionedFigure"/>
       </w:pPr>
       <w:r>
         <w:drawing>
           <wp:inline>
             <wp:extent cx="3733800" cy="2100262"/>
             <wp:effectExtent b="0" l="0" r="0" t="0"/>
-            <wp:docPr descr="" title="" id="15" name="Picture"/>
+            <wp:docPr descr="Пишем task1_grep.sh - разбор ключей ‘getopts’, поиск шаблона через grep с учётом регистра -C и номерами строк -n. Тестируем на файле in.txt" title="" id="22" name="Picture"/>
             <a:graphic>
               <a:graphicData uri="http://schemas.openxmlformats.org/drawingml/2006/picture">
                 <pic:pic>
                   <pic:nvPicPr>
-                    <pic:cNvPr descr="фото/2.png" id="16" name="Picture"/>
+                    <pic:cNvPr descr="image/2.png" id="23" name="Picture"/>
                     <pic:cNvPicPr>
                       <a:picLocks noChangeArrowheads="1" noChangeAspect="1"/>
                     </pic:cNvPicPr>
                   </pic:nvPicPr>
                   <pic:blipFill>
-                    <a:blip r:embed="rId14"/>
+                    <a:blip r:embed="rId21"/>
                     <a:stretch>
                       <a:fillRect/>
                     </a:stretch>
@@ -281,6 +550,23 @@
     </w:p>
     <w:p>
       <w:pPr>
+        <w:pStyle w:val="ImageCaption"/>
+      </w:pPr>
+      <w:r>
+        <w:t xml:space="preserve">Пишем task1_grep.sh - разбор ключей</w:t>
+      </w:r>
+      <w:r>
+        <w:t xml:space="preserve"> </w:t>
+      </w:r>
+      <w:r>
+        <w:t xml:space="preserve">‘getopts’</w:t>
+      </w:r>
+      <w:r>
+        <w:t xml:space="preserve">, поиск шаблона через grep с учётом регистра -C и номерами строк -n. Тестируем на файле in.txt</w:t>
+      </w:r>
+    </w:p>
+    <w:p>
+      <w:pPr>
         <w:pStyle w:val="BodyText"/>
       </w:pPr>
       <w:r>
@@ -289,25 +575,25 @@
     </w:p>
     <w:p>
       <w:pPr>
-        <w:pStyle w:val="BodyText"/>
+        <w:pStyle w:val="CaptionedFigure"/>
       </w:pPr>
       <w:r>
         <w:drawing>
           <wp:inline>
             <wp:extent cx="3733800" cy="2100262"/>
             <wp:effectExtent b="0" l="0" r="0" t="0"/>
-            <wp:docPr descr="" title="" id="18" name="Picture"/>
+            <wp:docPr descr="Пишем sign.c - знак числа через exit(), и task2_sign.sh, который вызывает sign и по $? выводит сообщение. Проверяем на числах 5, -3, 0" title="" id="25" name="Picture"/>
             <a:graphic>
               <a:graphicData uri="http://schemas.openxmlformats.org/drawingml/2006/picture">
                 <pic:pic>
                   <pic:nvPicPr>
-                    <pic:cNvPr descr="фото/3.png" id="19" name="Picture"/>
+                    <pic:cNvPr descr="image/3.png" id="26" name="Picture"/>
                     <pic:cNvPicPr>
                       <a:picLocks noChangeArrowheads="1" noChangeAspect="1"/>
                     </pic:cNvPicPr>
                   </pic:nvPicPr>
                   <pic:blipFill>
-                    <a:blip r:embed="rId17"/>
+                    <a:blip r:embed="rId24"/>
                     <a:stretch>
                       <a:fillRect/>
                     </a:stretch>
@@ -336,6 +622,14 @@
     </w:p>
     <w:p>
       <w:pPr>
+        <w:pStyle w:val="ImageCaption"/>
+      </w:pPr>
+      <w:r>
+        <w:t xml:space="preserve">Пишем sign.c - знак числа через exit(), и task2_sign.sh, который вызывает sign и по $? выводит сообщение. Проверяем на числах 5, -3, 0</w:t>
+      </w:r>
+    </w:p>
+    <w:p>
+      <w:pPr>
         <w:pStyle w:val="BodyText"/>
       </w:pPr>
       <w:r>
@@ -344,25 +638,25 @@
     </w:p>
     <w:p>
       <w:pPr>
-        <w:pStyle w:val="BodyText"/>
+        <w:pStyle w:val="CaptionedFigure"/>
       </w:pPr>
       <w:r>
         <w:drawing>
           <wp:inline>
             <wp:extent cx="3733800" cy="2100262"/>
             <wp:effectExtent b="0" l="0" r="0" t="0"/>
-            <wp:docPr descr="" title="" id="21" name="Picture"/>
+            <wp:docPr descr="Пишем task3_tmp.sh - создаёт N файлов через for/touch, тем же ключом -d их удаляет. Проверяем на 5 файлах" title="" id="28" name="Picture"/>
             <a:graphic>
               <a:graphicData uri="http://schemas.openxmlformats.org/drawingml/2006/picture">
                 <pic:pic>
                   <pic:nvPicPr>
-                    <pic:cNvPr descr="фото/4.png" id="22" name="Picture"/>
+                    <pic:cNvPr descr="image/4.png" id="29" name="Picture"/>
                     <pic:cNvPicPr>
                       <a:picLocks noChangeArrowheads="1" noChangeAspect="1"/>
                     </pic:cNvPicPr>
                   </pic:nvPicPr>
                   <pic:blipFill>
-                    <a:blip r:embed="rId20"/>
+                    <a:blip r:embed="rId27"/>
                     <a:stretch>
                       <a:fillRect/>
                     </a:stretch>
@@ -391,6 +685,14 @@
     </w:p>
     <w:p>
       <w:pPr>
+        <w:pStyle w:val="ImageCaption"/>
+      </w:pPr>
+      <w:r>
+        <w:t xml:space="preserve">Пишем task3_tmp.sh - создаёт N файлов через for/touch, тем же ключом -d их удаляет. Проверяем на 5 файлах</w:t>
+      </w:r>
+    </w:p>
+    <w:p>
+      <w:pPr>
         <w:pStyle w:val="BodyText"/>
       </w:pPr>
       <w:r>
@@ -399,25 +701,25 @@
     </w:p>
     <w:p>
       <w:pPr>
-        <w:pStyle w:val="BodyText"/>
+        <w:pStyle w:val="CaptionedFigure"/>
       </w:pPr>
       <w:r>
         <w:drawing>
           <wp:inline>
             <wp:extent cx="3733800" cy="2100262"/>
             <wp:effectExtent b="0" l="0" r="0" t="0"/>
-            <wp:docPr descr="" title="" id="24" name="Picture"/>
+            <wp:docPr descr="Пишем task4_backup.sh - архивирует каталог через tar, ключ -w архивирует только файлы за неделю через find -mtime -7" title="" id="31" name="Picture"/>
             <a:graphic>
               <a:graphicData uri="http://schemas.openxmlformats.org/drawingml/2006/picture">
                 <pic:pic>
                   <pic:nvPicPr>
-                    <pic:cNvPr descr="фото/5.png" id="25" name="Picture"/>
+                    <pic:cNvPr descr="image/5.png" id="32" name="Picture"/>
                     <pic:cNvPicPr>
                       <a:picLocks noChangeArrowheads="1" noChangeAspect="1"/>
                     </pic:cNvPicPr>
                   </pic:nvPicPr>
                   <pic:blipFill>
-                    <a:blip r:embed="rId23"/>
+                    <a:blip r:embed="rId30"/>
                     <a:stretch>
                       <a:fillRect/>
                     </a:stretch>
@@ -444,14 +746,22 @@
         </w:drawing>
       </w:r>
     </w:p>
-    <w:bookmarkEnd w:id="26"/>
-    <w:bookmarkStart w:id="27" w:name="выводы"/>
+    <w:p>
+      <w:pPr>
+        <w:pStyle w:val="ImageCaption"/>
+      </w:pPr>
+      <w:r>
+        <w:t xml:space="preserve">Пишем task4_backup.sh - архивирует каталог через tar, ключ -w архивирует только файлы за неделю через find -mtime -7</w:t>
+      </w:r>
+    </w:p>
+    <w:bookmarkEnd w:id="33"/>
+    <w:bookmarkStart w:id="34" w:name="результаты"/>
     <w:p>
       <w:pPr>
         <w:pStyle w:val="Heading1"/>
       </w:pPr>
       <w:r>
-        <w:t xml:space="preserve">Выводы</w:t>
+        <w:t xml:space="preserve">5. Результаты</w:t>
       </w:r>
     </w:p>
     <w:p>
@@ -459,11 +769,78 @@
         <w:pStyle w:val="FirstParagraph"/>
       </w:pPr>
       <w:r>
+        <w:t xml:space="preserve">В ходе выполнения работы получены следующие объективные результаты: Освоены ветвления/циклы: getopts, $?, for, tar+find.</w:t>
+      </w:r>
+    </w:p>
+    <w:bookmarkEnd w:id="34"/>
+    <w:bookmarkStart w:id="35" w:name="обсуждение-результатов"/>
+    <w:p>
+      <w:pPr>
+        <w:pStyle w:val="Heading1"/>
+      </w:pPr>
+      <w:r>
+        <w:t xml:space="preserve">6. Обсуждение результатов</w:t>
+      </w:r>
+    </w:p>
+    <w:p>
+      <w:pPr>
+        <w:pStyle w:val="FirstParagraph"/>
+      </w:pPr>
+      <w:r>
+        <w:t xml:space="preserve">Скрипты с ветвлениями и циклами корректно обработали граничные случаи (пустой ввод, несуществующие файлы).</w:t>
+      </w:r>
+    </w:p>
+    <w:bookmarkEnd w:id="35"/>
+    <w:bookmarkStart w:id="36" w:name="заключение"/>
+    <w:p>
+      <w:pPr>
+        <w:pStyle w:val="Heading1"/>
+      </w:pPr>
+      <w:r>
+        <w:t xml:space="preserve">7. Заключение</w:t>
+      </w:r>
+    </w:p>
+    <w:p>
+      <w:pPr>
+        <w:pStyle w:val="FirstParagraph"/>
+      </w:pPr>
+      <w:r>
         <w:t xml:space="preserve">Освоены ветвления/циклы: getopts, $?, for, tar+find.</w:t>
       </w:r>
     </w:p>
-    <w:bookmarkEnd w:id="27"/>
-    <w:bookmarkStart w:id="28" w:name="ответы-на-контрольные-вопросы"/>
+    <w:bookmarkEnd w:id="36"/>
+    <w:bookmarkStart w:id="39" w:name="список-литературы"/>
+    <w:p>
+      <w:pPr>
+        <w:pStyle w:val="Heading1"/>
+      </w:pPr>
+      <w:r>
+        <w:t xml:space="preserve">Список литературы</w:t>
+      </w:r>
+    </w:p>
+    <w:bookmarkStart w:id="38" w:name="refs"/>
+    <w:bookmarkStart w:id="37" w:name="ref-newham_book_learning-bash_en"/>
+    <w:p>
+      <w:pPr>
+        <w:pStyle w:val="Bibliography"/>
+      </w:pPr>
+      <w:r>
+        <w:t xml:space="preserve">1.</w:t>
+      </w:r>
+      <w:r>
+        <w:t xml:space="preserve"> </w:t>
+      </w:r>
+      <w:r>
+        <w:t xml:space="preserve">	</w:t>
+      </w:r>
+      <w:r>
+        <w:t xml:space="preserve">Newham C., Rosenblatt B. Learning the bash Shell. O’Reilly Media, 2005.</w:t>
+      </w:r>
+    </w:p>
+    <w:bookmarkEnd w:id="37"/>
+    <w:bookmarkEnd w:id="38"/>
+    <w:bookmarkEnd w:id="39"/>
+    <w:bookmarkStart w:id="40" w:name="ответы-на-контрольные-вопросы"/>
     <w:p>
       <w:pPr>
         <w:pStyle w:val="Heading1"/>
@@ -651,7 +1028,7 @@
         <w:t xml:space="preserve">while - выполняется пока условие истинно, until - выполняется пока ложно.</w:t>
       </w:r>
     </w:p>
-    <w:bookmarkEnd w:id="28"/>
+    <w:bookmarkEnd w:id="40"/>
     <w:sectPr>
       <w:footnotePr>
         <w:numRestart w:val="eachSect"/>
@@ -879,10 +1256,10 @@
   <w:docDefaults>
     <w:rPrDefault>
       <w:rPr>
-        <w:rFonts w:asciiTheme="minorHAnsi" w:cstheme="minorBidi" w:eastAsiaTheme="minorHAnsi" w:hAnsiTheme="minorHAnsi"/>
+        <w:rFonts w:asciiTheme="minorHAnsi" w:cstheme="minorBidi" w:eastAsiaTheme="minorEastAsia" w:hAnsiTheme="minorHAnsi"/>
         <w:sz w:val="24"/>
         <w:szCs w:val="24"/>
-        <w:lang w:bidi="ar-SA" w:eastAsia="en-US" w:val="en-US"/>
+        <w:lang w:bidi="ar-SA" w:eastAsia="zh-CN" w:val="ru-RU"/>
       </w:rPr>
     </w:rPrDefault>
     <w:pPrDefault>
@@ -1423,13 +1800,6 @@
       </w:tblCellMar>
     </w:tblPr>
     <w:tblStylePr w:type="firstRow">
-      <w:tblPr>
-        <w:jc w:val="left"/>
-        <w:tblInd w:type="dxa" w:w="0"/>
-      </w:tblPr>
-      <w:trPr>
-        <w:jc w:val="left"/>
-      </w:trPr>
       <w:tcPr>
         <w:tcBorders>
           <w:bottom w:val="single"/>
@@ -1543,6 +1913,7 @@
     <w:link w:val="VerbatimChar"/>
     <w:pPr>
       <w:wordWrap w:val="off"/>
+      <w:shd w:val="clear" w:fill="f1f3f5"/>
     </w:pPr>
   </w:style>
   <w:style w:type="character" w:customStyle="1" w:styleId="KeywordTok">
@@ -1550,93 +1921,104 @@
     <w:basedOn w:val="VerbatimChar"/>
     <w:rPr>
       <w:b/>
-      <w:color w:val="007020"/>
+      <w:color w:val="003b4f"/>
+      <w:shd w:val="clear" w:fill="f1f3f5"/>
     </w:rPr>
   </w:style>
   <w:style w:type="character" w:customStyle="1" w:styleId="DataTypeTok">
     <w:name w:val="DataTypeTok"/>
     <w:basedOn w:val="VerbatimChar"/>
     <w:rPr>
-      <w:color w:val="902000"/>
+      <w:color w:val="ad0000"/>
+      <w:shd w:val="clear" w:fill="f1f3f5"/>
     </w:rPr>
   </w:style>
   <w:style w:type="character" w:customStyle="1" w:styleId="DecValTok">
     <w:name w:val="DecValTok"/>
     <w:basedOn w:val="VerbatimChar"/>
     <w:rPr>
-      <w:color w:val="40a070"/>
+      <w:color w:val="ad0000"/>
+      <w:shd w:val="clear" w:fill="f1f3f5"/>
     </w:rPr>
   </w:style>
   <w:style w:type="character" w:customStyle="1" w:styleId="BaseNTok">
     <w:name w:val="BaseNTok"/>
     <w:basedOn w:val="VerbatimChar"/>
     <w:rPr>
-      <w:color w:val="40a070"/>
+      <w:color w:val="ad0000"/>
+      <w:shd w:val="clear" w:fill="f1f3f5"/>
     </w:rPr>
   </w:style>
   <w:style w:type="character" w:customStyle="1" w:styleId="FloatTok">
     <w:name w:val="FloatTok"/>
     <w:basedOn w:val="VerbatimChar"/>
     <w:rPr>
-      <w:color w:val="40a070"/>
+      <w:color w:val="ad0000"/>
+      <w:shd w:val="clear" w:fill="f1f3f5"/>
     </w:rPr>
   </w:style>
   <w:style w:type="character" w:customStyle="1" w:styleId="ConstantTok">
     <w:name w:val="ConstantTok"/>
     <w:basedOn w:val="VerbatimChar"/>
     <w:rPr>
-      <w:color w:val="880000"/>
+      <w:color w:val="8f5902"/>
+      <w:shd w:val="clear" w:fill="f1f3f5"/>
     </w:rPr>
   </w:style>
   <w:style w:type="character" w:customStyle="1" w:styleId="CharTok">
     <w:name w:val="CharTok"/>
     <w:basedOn w:val="VerbatimChar"/>
     <w:rPr>
-      <w:color w:val="4070a0"/>
+      <w:color w:val="20794d"/>
+      <w:shd w:val="clear" w:fill="f1f3f5"/>
     </w:rPr>
   </w:style>
   <w:style w:type="character" w:customStyle="1" w:styleId="SpecialCharTok">
     <w:name w:val="SpecialCharTok"/>
     <w:basedOn w:val="VerbatimChar"/>
     <w:rPr>
-      <w:color w:val="4070a0"/>
+      <w:color w:val="5e5e5e"/>
+      <w:shd w:val="clear" w:fill="f1f3f5"/>
     </w:rPr>
   </w:style>
   <w:style w:type="character" w:customStyle="1" w:styleId="StringTok">
     <w:name w:val="StringTok"/>
     <w:basedOn w:val="VerbatimChar"/>
     <w:rPr>
-      <w:color w:val="4070a0"/>
+      <w:color w:val="20794d"/>
+      <w:shd w:val="clear" w:fill="f1f3f5"/>
     </w:rPr>
   </w:style>
   <w:style w:type="character" w:customStyle="1" w:styleId="VerbatimStringTok">
     <w:name w:val="VerbatimStringTok"/>
     <w:basedOn w:val="VerbatimChar"/>
     <w:rPr>
-      <w:color w:val="4070a0"/>
+      <w:color w:val="20794d"/>
+      <w:shd w:val="clear" w:fill="f1f3f5"/>
     </w:rPr>
   </w:style>
   <w:style w:type="character" w:customStyle="1" w:styleId="SpecialStringTok">
     <w:name w:val="SpecialStringTok"/>
     <w:basedOn w:val="VerbatimChar"/>
     <w:rPr>
-      <w:color w:val="bb6688"/>
+      <w:color w:val="20794d"/>
+      <w:shd w:val="clear" w:fill="f1f3f5"/>
     </w:rPr>
   </w:style>
   <w:style w:type="character" w:customStyle="1" w:styleId="ImportTok">
     <w:name w:val="ImportTok"/>
     <w:basedOn w:val="VerbatimChar"/>
     <w:rPr>
-      <w:b/>
-      <w:color w:val="008000"/>
+      <w:color w:val="00769e"/>
+      <w:shd w:val="clear" w:fill="f1f3f5"/>
     </w:rPr>
   </w:style>
   <w:style w:type="character" w:customStyle="1" w:styleId="CommentTok">
     <w:name w:val="CommentTok"/>
     <w:basedOn w:val="VerbatimChar"/>
     <w:rPr>
-      <w:i/>
-      <w:color w:val="60a0b0"/>
+      <w:color w:val="5e5e5e"/>
+      <w:shd w:val="clear" w:fill="f1f3f5"/>
     </w:rPr>
   </w:style>
   <w:style w:type="character" w:customStyle="1" w:styleId="DocumentationTok">
@@ -1644,46 +2026,49 @@
     <w:basedOn w:val="VerbatimChar"/>
     <w:rPr>
       <w:i/>
-      <w:color w:val="ba2121"/>
+      <w:color w:val="5e5e5e"/>
+      <w:shd w:val="clear" w:fill="f1f3f5"/>
     </w:rPr>
   </w:style>
   <w:style w:type="character" w:customStyle="1" w:styleId="AnnotationTok">
     <w:name w:val="AnnotationTok"/>
     <w:basedOn w:val="VerbatimChar"/>
     <w:rPr>
-      <w:b/>
-      <w:i/>
-      <w:color w:val="60a0b0"/>
+      <w:color w:val="5e5e5e"/>
+      <w:shd w:val="clear" w:fill="f1f3f5"/>
     </w:rPr>
   </w:style>
   <w:style w:type="character" w:customStyle="1" w:styleId="CommentVarTok">
     <w:name w:val="CommentVarTok"/>
     <w:basedOn w:val="VerbatimChar"/>
     <w:rPr>
-      <w:b/>
       <w:i/>
-      <w:color w:val="60a0b0"/>
+      <w:color w:val="5e5e5e"/>
+      <w:shd w:val="clear" w:fill="f1f3f5"/>
     </w:rPr>
   </w:style>
   <w:style w:type="character" w:customStyle="1" w:styleId="OtherTok">
     <w:name w:val="OtherTok"/>
     <w:basedOn w:val="VerbatimChar"/>
     <w:rPr>
-      <w:color w:val="007020"/>
+      <w:color w:val="003b4f"/>
+      <w:shd w:val="clear" w:fill="f1f3f5"/>
     </w:rPr>
   </w:style>
   <w:style w:type="character" w:customStyle="1" w:styleId="FunctionTok">
     <w:name w:val="FunctionTok"/>
     <w:basedOn w:val="VerbatimChar"/>
     <w:rPr>
-      <w:color w:val="06287e"/>
+      <w:color w:val="4758ab"/>
+      <w:shd w:val="clear" w:fill="f1f3f5"/>
     </w:rPr>
   </w:style>
   <w:style w:type="character" w:customStyle="1" w:styleId="VariableTok">
     <w:name w:val="VariableTok"/>
     <w:basedOn w:val="VerbatimChar"/>
     <w:rPr>
-      <w:color w:val="19177c"/>
+      <w:color w:val="111111"/>
+      <w:shd w:val="clear" w:fill="f1f3f5"/>
     </w:rPr>
   </w:style>
   <w:style w:type="character" w:customStyle="1" w:styleId="ControlFlowTok">
@@ -1691,85 +2076,98 @@
     <w:basedOn w:val="VerbatimChar"/>
     <w:rPr>
       <w:b/>
-      <w:color w:val="007020"/>
+      <w:color w:val="003b4f"/>
+      <w:shd w:val="clear" w:fill="f1f3f5"/>
     </w:rPr>
   </w:style>
   <w:style w:type="character" w:customStyle="1" w:styleId="OperatorTok">
     <w:name w:val="OperatorTok"/>
     <w:basedOn w:val="VerbatimChar"/>
     <w:rPr>
-      <w:color w:val="666666"/>
+      <w:color w:val="5e5e5e"/>
+      <w:shd w:val="clear" w:fill="f1f3f5"/>
     </w:rPr>
   </w:style>
   <w:style w:type="character" w:customStyle="1" w:styleId="BuiltInTok">
     <w:name w:val="BuiltInTok"/>
     <w:basedOn w:val="VerbatimChar"/>
     <w:rPr>
-      <w:color w:val="008000"/>
+      <w:color w:val="003b4f"/>
+      <w:shd w:val="clear" w:fill="f1f3f5"/>
     </w:rPr>
   </w:style>
   <w:style w:type="character" w:customStyle="1" w:styleId="ExtensionTok">
     <w:name w:val="ExtensionTok"/>
     <w:basedOn w:val="VerbatimChar"/>
-    <w:rPr/>
+    <w:rPr>
+      <w:color w:val="003b4f"/>
+      <w:shd w:val="clear" w:fill="f1f3f5"/>
+    </w:rPr>
   </w:style>
   <w:style w:type="character" w:customStyle="1" w:styleId="PreprocessorTok">
     <w:name w:val="PreprocessorTok"/>
     <w:basedOn w:val="VerbatimChar"/>
     <w:rPr>
-      <w:color w:val="bc7a00"/>
+      <w:color w:val="ad0000"/>
+      <w:shd w:val="clear" w:fill="f1f3f5"/>
     </w:rPr>
   </w:style>
   <w:style w:type="character" w:customStyle="1" w:styleId="AttributeTok">
     <w:name w:val="AttributeTok"/>
     <w:basedOn w:val="VerbatimChar"/>
     <w:rPr>
-      <w:color w:val="7d9029"/>
+      <w:color w:val="657422"/>
+      <w:shd w:val="clear" w:fill="f1f3f5"/>
     </w:rPr>
   </w:style>
   <w:style w:type="character" w:customStyle="1" w:styleId="RegionMarkerTok">
     <w:name w:val="RegionMarkerTok"/>
     <w:basedOn w:val="VerbatimChar"/>
-    <w:rPr/>
+    <w:rPr>
+      <w:color w:val="003b4f"/>
+      <w:shd w:val="clear" w:fill="f1f3f5"/>
+    </w:rPr>
   </w:style>
   <w:style w:type="character" w:customStyle="1" w:styleId="InformationTok">
     <w:name w:val="InformationTok"/>
     <w:basedOn w:val="VerbatimChar"/>
     <w:rPr>
-      <w:b/>
-      <w:i/>
-      <w:color w:val="60a0b0"/>
+      <w:color w:val="5e5e5e"/>
+      <w:shd w:val="clear" w:fill="f1f3f5"/>
     </w:rPr>
   </w:style>
   <w:style w:type="character" w:customStyle="1" w:styleId="WarningTok">
     <w:name w:val="WarningTok"/>
     <w:basedOn w:val="VerbatimChar"/>
     <w:rPr>
-      <w:b/>
       <w:i/>
-      <w:color w:val="60a0b0"/>
+      <w:color w:val="5e5e5e"/>
+      <w:shd w:val="clear" w:fill="f1f3f5"/>
     </w:rPr>
   </w:style>
   <w:style w:type="character" w:customStyle="1" w:styleId="AlertTok">
     <w:name w:val="AlertTok"/>
     <w:basedOn w:val="VerbatimChar"/>
     <w:rPr>
-      <w:b/>
-      <w:color w:val="ff0000"/>
+      <w:color w:val="ad0000"/>
+      <w:shd w:val="clear" w:fill="f1f3f5"/>
     </w:rPr>
   </w:style>
   <w:style w:type="character" w:customStyle="1" w:styleId="ErrorTok">
     <w:name w:val="ErrorTok"/>
     <w:basedOn w:val="VerbatimChar"/>
     <w:rPr>
-      <w:b/>
-      <w:color w:val="ff0000"/>
+      <w:color w:val="ad0000"/>
+      <w:shd w:val="clear" w:fill="f1f3f5"/>
     </w:rPr>
   </w:style>
   <w:style w:type="character" w:customStyle="1" w:styleId="NormalTok">
     <w:name w:val="NormalTok"/>
     <w:basedOn w:val="VerbatimChar"/>
-    <w:rPr/>
+    <w:rPr>
+      <w:color w:val="003b4f"/>
+      <w:shd w:val="clear" w:fill="f1f3f5"/>
+    </w:rPr>
   </w:style>
 </w:styles>
 </file>

</xml_diff>